<commit_message>
feat: indexador de Envio (puntaje verificado comprobable), SDK de Aval actualizado, instrucciones para jueces y borrador del articulo de Qwen
Co-Authored-By: Claude Sonnet 5.5 <noreply@anthropic.com>
</commit_message>
<xml_diff>
--- a/docs/Preste_Implementacion_y_Pitch.docx
+++ b/docs/Preste_Implementacion_y_Pitch.docx
@@ -1662,7 +1662,7 @@
                 <w:sz w:val="19"/>
                 <w:szCs w:val="19"/>
               </w:rPr>
-              <w:t xml:space="preserve">Datos de cadena</w:t>
+              <w:t xml:space="preserve">Indexador</w:t>
             </w:r>
           </w:p>
         </w:tc>
@@ -1692,7 +1692,7 @@
                 <w:sz w:val="19"/>
                 <w:szCs w:val="19"/>
               </w:rPr>
-              <w:t xml:space="preserve">RPC, movimientos, avisos</w:t>
+              <w:t xml:space="preserve">Puntaje verificado del servicio, comprobable</w:t>
             </w:r>
           </w:p>
         </w:tc>
@@ -1724,14 +1724,14 @@
                 <w:sz w:val="19"/>
                 <w:szCs w:val="19"/>
               </w:rPr>
-              <w:t xml:space="preserve">Alchemy</w:t>
-            </w:r>
-            <w:r>
-              <w:rPr>
-                <w:sz w:val="19"/>
-                <w:szCs w:val="19"/>
-              </w:rPr>
-              <w:t xml:space="preserve"> (RPC y </w:t>
+              <w:t xml:space="preserve">Envio HyperIndex</w:t>
+            </w:r>
+            <w:r>
+              <w:rPr>
+                <w:sz w:val="19"/>
+                <w:szCs w:val="19"/>
+              </w:rPr>
+              <w:t xml:space="preserve"> (de Alan, GraphQL) + </w:t>
             </w:r>
             <w:r>
               <w:rPr>
@@ -1740,38 +1740,15 @@
                 <w:sz w:val="18"/>
                 <w:szCs w:val="18"/>
               </w:rPr>
-              <w:t xml:space="preserve">alchemy_getAssetTransfers</w:t>
-            </w:r>
-            <w:r>
-              <w:rPr>
-                <w:sz w:val="19"/>
-                <w:szCs w:val="19"/>
-              </w:rPr>
-              <w:t xml:space="preserve">)</w:t>
-            </w:r>
-          </w:p>
-        </w:tc>
-        <w:tc>
-          <w:tcPr>
-            <w:tcW w:type="dxa" w:w="2738"/>
-            <w:tcBorders>
-              <w:top w:val="single" w:color="C9D3CD" w:sz="4"/>
-              <w:left w:val="single" w:color="C9D3CD" w:sz="4"/>
-              <w:bottom w:val="single" w:color="C9D3CD" w:sz="4"/>
-              <w:right w:val="single" w:color="C9D3CD" w:sz="4"/>
-            </w:tcBorders>
-            <w:shd w:fill="FFFFFF" w:val="clear"/>
-            <w:tcMar>
-              <w:top w:type="dxa" w:w="60"/>
-              <w:left w:type="dxa" w:w="90"/>
-              <w:bottom w:type="dxa" w:w="60"/>
-              <w:right w:type="dxa" w:w="90"/>
-            </w:tcMar>
-          </w:tcPr>
-          <w:p>
-            <w:pPr>
-              <w:spacing w:after="20"/>
-            </w:pPr>
+              <w:t xml:space="preserve">createIndexerClient</w:t>
+            </w:r>
+            <w:r>
+              <w:rPr>
+                <w:sz w:val="19"/>
+                <w:szCs w:val="19"/>
+              </w:rPr>
+              <w:t xml:space="preserve"> del SDK; la app lo recalcula con </w:t>
+            </w:r>
             <w:r>
               <w:rPr>
                 <w:rFonts w:ascii="Consolas" w:cs="Consolas" w:eastAsia="Consolas" w:hAnsi="Consolas"/>
@@ -1779,15 +1756,31 @@
                 <w:sz w:val="18"/>
                 <w:szCs w:val="18"/>
               </w:rPr>
-              <w:t xml:space="preserve">lib/aval/config.js</w:t>
-            </w:r>
-            <w:r>
-              <w:rPr>
-                <w:sz w:val="19"/>
-                <w:szCs w:val="19"/>
-              </w:rPr>
-              <w:t xml:space="preserve">, </w:t>
-            </w:r>
+              <w:t xml:space="preserve">verifyAgentScore</w:t>
+            </w:r>
+          </w:p>
+        </w:tc>
+        <w:tc>
+          <w:tcPr>
+            <w:tcW w:type="dxa" w:w="2738"/>
+            <w:tcBorders>
+              <w:top w:val="single" w:color="C9D3CD" w:sz="4"/>
+              <w:left w:val="single" w:color="C9D3CD" w:sz="4"/>
+              <w:bottom w:val="single" w:color="C9D3CD" w:sz="4"/>
+              <w:right w:val="single" w:color="C9D3CD" w:sz="4"/>
+            </w:tcBorders>
+            <w:shd w:fill="FFFFFF" w:val="clear"/>
+            <w:tcMar>
+              <w:top w:type="dxa" w:w="60"/>
+              <w:left w:type="dxa" w:w="90"/>
+              <w:bottom w:type="dxa" w:w="60"/>
+              <w:right w:type="dxa" w:w="90"/>
+            </w:tcMar>
+          </w:tcPr>
+          <w:p>
+            <w:pPr>
+              <w:spacing w:after="20"/>
+            </w:pPr>
             <w:r>
               <w:rPr>
                 <w:rFonts w:ascii="Consolas" w:cs="Consolas" w:eastAsia="Consolas" w:hAnsi="Consolas"/>
@@ -1795,7 +1788,7 @@
                 <w:sz w:val="18"/>
                 <w:szCs w:val="18"/>
               </w:rPr>
-              <w:t xml:space="preserve">lib/alchemy.js</w:t>
+              <w:t xml:space="preserve">api/indexador</w:t>
             </w:r>
             <w:r>
               <w:rPr>
@@ -1811,7 +1804,7 @@
                 <w:sz w:val="18"/>
                 <w:szCs w:val="18"/>
               </w:rPr>
-              <w:t xml:space="preserve">api/avisos</w:t>
+              <w:t xml:space="preserve">actividad/PuntajeVerificado.jsx</w:t>
             </w:r>
           </w:p>
         </w:tc>
@@ -1846,7 +1839,7 @@
                 <w:sz w:val="19"/>
                 <w:szCs w:val="19"/>
               </w:rPr>
-              <w:t xml:space="preserve">QR</w:t>
+              <w:t xml:space="preserve">Datos de cadena</w:t>
             </w:r>
           </w:p>
         </w:tc>
@@ -1876,7 +1869,7 @@
                 <w:sz w:val="19"/>
                 <w:szCs w:val="19"/>
               </w:rPr>
-              <w:t xml:space="preserve">Calificación presencial</w:t>
+              <w:t xml:space="preserve">RPC, movimientos, avisos</w:t>
             </w:r>
           </w:p>
         </w:tc>
@@ -1908,54 +1901,15 @@
                 <w:sz w:val="19"/>
                 <w:szCs w:val="19"/>
               </w:rPr>
-              <w:t xml:space="preserve">qrcode</w:t>
-            </w:r>
-            <w:r>
-              <w:rPr>
-                <w:sz w:val="19"/>
-                <w:szCs w:val="19"/>
-              </w:rPr>
-              <w:t xml:space="preserve"> (generar) y </w:t>
-            </w:r>
-            <w:r>
-              <w:rPr>
-                <w:b/>
-                <w:bCs/>
-                <w:sz w:val="19"/>
-                <w:szCs w:val="19"/>
-              </w:rPr>
-              <w:t xml:space="preserve">jsqr</w:t>
-            </w:r>
-            <w:r>
-              <w:rPr>
-                <w:sz w:val="19"/>
-                <w:szCs w:val="19"/>
-              </w:rPr>
-              <w:t xml:space="preserve"> (escanear)</w:t>
-            </w:r>
-          </w:p>
-        </w:tc>
-        <w:tc>
-          <w:tcPr>
-            <w:tcW w:type="dxa" w:w="2738"/>
-            <w:tcBorders>
-              <w:top w:val="single" w:color="C9D3CD" w:sz="4"/>
-              <w:left w:val="single" w:color="C9D3CD" w:sz="4"/>
-              <w:bottom w:val="single" w:color="C9D3CD" w:sz="4"/>
-              <w:right w:val="single" w:color="C9D3CD" w:sz="4"/>
-            </w:tcBorders>
-            <w:shd w:fill="F3F8F5" w:val="clear"/>
-            <w:tcMar>
-              <w:top w:type="dxa" w:w="60"/>
-              <w:left w:type="dxa" w:w="90"/>
-              <w:bottom w:type="dxa" w:w="60"/>
-              <w:right w:type="dxa" w:w="90"/>
-            </w:tcMar>
-          </w:tcPr>
-          <w:p>
-            <w:pPr>
-              <w:spacing w:after="20"/>
-            </w:pPr>
+              <w:t xml:space="preserve">Alchemy</w:t>
+            </w:r>
+            <w:r>
+              <w:rPr>
+                <w:sz w:val="19"/>
+                <w:szCs w:val="19"/>
+              </w:rPr>
+              <w:t xml:space="preserve"> (RPC y </w:t>
+            </w:r>
             <w:r>
               <w:rPr>
                 <w:rFonts w:ascii="Consolas" w:cs="Consolas" w:eastAsia="Consolas" w:hAnsi="Consolas"/>
@@ -1963,15 +1917,38 @@
                 <w:sz w:val="18"/>
                 <w:szCs w:val="18"/>
               </w:rPr>
-              <w:t xml:space="preserve">mi-codigo/</w:t>
-            </w:r>
-            <w:r>
-              <w:rPr>
-                <w:sz w:val="19"/>
-                <w:szCs w:val="19"/>
-              </w:rPr>
-              <w:t xml:space="preserve">, </w:t>
-            </w:r>
+              <w:t xml:space="preserve">alchemy_getAssetTransfers</w:t>
+            </w:r>
+            <w:r>
+              <w:rPr>
+                <w:sz w:val="19"/>
+                <w:szCs w:val="19"/>
+              </w:rPr>
+              <w:t xml:space="preserve">)</w:t>
+            </w:r>
+          </w:p>
+        </w:tc>
+        <w:tc>
+          <w:tcPr>
+            <w:tcW w:type="dxa" w:w="2738"/>
+            <w:tcBorders>
+              <w:top w:val="single" w:color="C9D3CD" w:sz="4"/>
+              <w:left w:val="single" w:color="C9D3CD" w:sz="4"/>
+              <w:bottom w:val="single" w:color="C9D3CD" w:sz="4"/>
+              <w:right w:val="single" w:color="C9D3CD" w:sz="4"/>
+            </w:tcBorders>
+            <w:shd w:fill="F3F8F5" w:val="clear"/>
+            <w:tcMar>
+              <w:top w:type="dxa" w:w="60"/>
+              <w:left w:type="dxa" w:w="90"/>
+              <w:bottom w:type="dxa" w:w="60"/>
+              <w:right w:type="dxa" w:w="90"/>
+            </w:tcMar>
+          </w:tcPr>
+          <w:p>
+            <w:pPr>
+              <w:spacing w:after="20"/>
+            </w:pPr>
             <w:r>
               <w:rPr>
                 <w:rFonts w:ascii="Consolas" w:cs="Consolas" w:eastAsia="Consolas" w:hAnsi="Consolas"/>
@@ -1979,7 +1956,39 @@
                 <w:sz w:val="18"/>
                 <w:szCs w:val="18"/>
               </w:rPr>
-              <w:t xml:space="preserve">EscanerQR.jsx</w:t>
+              <w:t xml:space="preserve">lib/aval/config.js</w:t>
+            </w:r>
+            <w:r>
+              <w:rPr>
+                <w:sz w:val="19"/>
+                <w:szCs w:val="19"/>
+              </w:rPr>
+              <w:t xml:space="preserve">, </w:t>
+            </w:r>
+            <w:r>
+              <w:rPr>
+                <w:rFonts w:ascii="Consolas" w:cs="Consolas" w:eastAsia="Consolas" w:hAnsi="Consolas"/>
+                <w:color w:val="1B4332"/>
+                <w:sz w:val="18"/>
+                <w:szCs w:val="18"/>
+              </w:rPr>
+              <w:t xml:space="preserve">lib/alchemy.js</w:t>
+            </w:r>
+            <w:r>
+              <w:rPr>
+                <w:sz w:val="19"/>
+                <w:szCs w:val="19"/>
+              </w:rPr>
+              <w:t xml:space="preserve">, </w:t>
+            </w:r>
+            <w:r>
+              <w:rPr>
+                <w:rFonts w:ascii="Consolas" w:cs="Consolas" w:eastAsia="Consolas" w:hAnsi="Consolas"/>
+                <w:color w:val="1B4332"/>
+                <w:sz w:val="18"/>
+                <w:szCs w:val="18"/>
+              </w:rPr>
+              <w:t xml:space="preserve">api/avisos</w:t>
             </w:r>
           </w:p>
         </w:tc>
@@ -2014,7 +2023,7 @@
                 <w:sz w:val="19"/>
                 <w:szCs w:val="19"/>
               </w:rPr>
-              <w:t xml:space="preserve">Hosting</w:t>
+              <w:t xml:space="preserve">QR</w:t>
             </w:r>
           </w:p>
         </w:tc>
@@ -2044,7 +2053,7 @@
                 <w:sz w:val="19"/>
                 <w:szCs w:val="19"/>
               </w:rPr>
-              <w:t xml:space="preserve">App pública y almacén</w:t>
+              <w:t xml:space="preserve">Calificación presencial</w:t>
             </w:r>
           </w:p>
         </w:tc>
@@ -2076,14 +2085,14 @@
                 <w:sz w:val="19"/>
                 <w:szCs w:val="19"/>
               </w:rPr>
-              <w:t xml:space="preserve">Vercel</w:t>
-            </w:r>
-            <w:r>
-              <w:rPr>
-                <w:sz w:val="19"/>
-                <w:szCs w:val="19"/>
-              </w:rPr>
-              <w:t xml:space="preserve"> (producción) y </w:t>
+              <w:t xml:space="preserve">qrcode</w:t>
+            </w:r>
+            <w:r>
+              <w:rPr>
+                <w:sz w:val="19"/>
+                <w:szCs w:val="19"/>
+              </w:rPr>
+              <w:t xml:space="preserve"> (generar) y </w:t>
             </w:r>
             <w:r>
               <w:rPr>
@@ -2092,6 +2101,174 @@
                 <w:sz w:val="19"/>
                 <w:szCs w:val="19"/>
               </w:rPr>
+              <w:t xml:space="preserve">jsqr</w:t>
+            </w:r>
+            <w:r>
+              <w:rPr>
+                <w:sz w:val="19"/>
+                <w:szCs w:val="19"/>
+              </w:rPr>
+              <w:t xml:space="preserve"> (escanear)</w:t>
+            </w:r>
+          </w:p>
+        </w:tc>
+        <w:tc>
+          <w:tcPr>
+            <w:tcW w:type="dxa" w:w="2738"/>
+            <w:tcBorders>
+              <w:top w:val="single" w:color="C9D3CD" w:sz="4"/>
+              <w:left w:val="single" w:color="C9D3CD" w:sz="4"/>
+              <w:bottom w:val="single" w:color="C9D3CD" w:sz="4"/>
+              <w:right w:val="single" w:color="C9D3CD" w:sz="4"/>
+            </w:tcBorders>
+            <w:shd w:fill="FFFFFF" w:val="clear"/>
+            <w:tcMar>
+              <w:top w:type="dxa" w:w="60"/>
+              <w:left w:type="dxa" w:w="90"/>
+              <w:bottom w:type="dxa" w:w="60"/>
+              <w:right w:type="dxa" w:w="90"/>
+            </w:tcMar>
+          </w:tcPr>
+          <w:p>
+            <w:pPr>
+              <w:spacing w:after="20"/>
+            </w:pPr>
+            <w:r>
+              <w:rPr>
+                <w:rFonts w:ascii="Consolas" w:cs="Consolas" w:eastAsia="Consolas" w:hAnsi="Consolas"/>
+                <w:color w:val="1B4332"/>
+                <w:sz w:val="18"/>
+                <w:szCs w:val="18"/>
+              </w:rPr>
+              <w:t xml:space="preserve">mi-codigo/</w:t>
+            </w:r>
+            <w:r>
+              <w:rPr>
+                <w:sz w:val="19"/>
+                <w:szCs w:val="19"/>
+              </w:rPr>
+              <w:t xml:space="preserve">, </w:t>
+            </w:r>
+            <w:r>
+              <w:rPr>
+                <w:rFonts w:ascii="Consolas" w:cs="Consolas" w:eastAsia="Consolas" w:hAnsi="Consolas"/>
+                <w:color w:val="1B4332"/>
+                <w:sz w:val="18"/>
+                <w:szCs w:val="18"/>
+              </w:rPr>
+              <w:t xml:space="preserve">EscanerQR.jsx</w:t>
+            </w:r>
+          </w:p>
+        </w:tc>
+      </w:tr>
+      <w:tr>
+        <w:trPr>
+          <w:cantSplit/>
+        </w:trPr>
+        <w:tc>
+          <w:tcPr>
+            <w:tcW w:type="dxa" w:w="1300"/>
+            <w:tcBorders>
+              <w:top w:val="single" w:color="C9D3CD" w:sz="4"/>
+              <w:left w:val="single" w:color="C9D3CD" w:sz="4"/>
+              <w:bottom w:val="single" w:color="C9D3CD" w:sz="4"/>
+              <w:right w:val="single" w:color="C9D3CD" w:sz="4"/>
+            </w:tcBorders>
+            <w:shd w:fill="F3F8F5" w:val="clear"/>
+            <w:tcMar>
+              <w:top w:type="dxa" w:w="60"/>
+              <w:left w:type="dxa" w:w="90"/>
+              <w:bottom w:type="dxa" w:w="60"/>
+              <w:right w:type="dxa" w:w="90"/>
+            </w:tcMar>
+          </w:tcPr>
+          <w:p>
+            <w:pPr>
+              <w:spacing w:after="20"/>
+            </w:pPr>
+            <w:r>
+              <w:rPr>
+                <w:sz w:val="19"/>
+                <w:szCs w:val="19"/>
+              </w:rPr>
+              <w:t xml:space="preserve">Hosting</w:t>
+            </w:r>
+          </w:p>
+        </w:tc>
+        <w:tc>
+          <w:tcPr>
+            <w:tcW w:type="dxa" w:w="2300"/>
+            <w:tcBorders>
+              <w:top w:val="single" w:color="C9D3CD" w:sz="4"/>
+              <w:left w:val="single" w:color="C9D3CD" w:sz="4"/>
+              <w:bottom w:val="single" w:color="C9D3CD" w:sz="4"/>
+              <w:right w:val="single" w:color="C9D3CD" w:sz="4"/>
+            </w:tcBorders>
+            <w:shd w:fill="F3F8F5" w:val="clear"/>
+            <w:tcMar>
+              <w:top w:type="dxa" w:w="60"/>
+              <w:left w:type="dxa" w:w="90"/>
+              <w:bottom w:type="dxa" w:w="60"/>
+              <w:right w:type="dxa" w:w="90"/>
+            </w:tcMar>
+          </w:tcPr>
+          <w:p>
+            <w:pPr>
+              <w:spacing w:after="20"/>
+            </w:pPr>
+            <w:r>
+              <w:rPr>
+                <w:sz w:val="19"/>
+                <w:szCs w:val="19"/>
+              </w:rPr>
+              <w:t xml:space="preserve">App pública y almacén</w:t>
+            </w:r>
+          </w:p>
+        </w:tc>
+        <w:tc>
+          <w:tcPr>
+            <w:tcW w:type="dxa" w:w="3300"/>
+            <w:tcBorders>
+              <w:top w:val="single" w:color="C9D3CD" w:sz="4"/>
+              <w:left w:val="single" w:color="C9D3CD" w:sz="4"/>
+              <w:bottom w:val="single" w:color="C9D3CD" w:sz="4"/>
+              <w:right w:val="single" w:color="C9D3CD" w:sz="4"/>
+            </w:tcBorders>
+            <w:shd w:fill="F3F8F5" w:val="clear"/>
+            <w:tcMar>
+              <w:top w:type="dxa" w:w="60"/>
+              <w:left w:type="dxa" w:w="90"/>
+              <w:bottom w:type="dxa" w:w="60"/>
+              <w:right w:type="dxa" w:w="90"/>
+            </w:tcMar>
+          </w:tcPr>
+          <w:p>
+            <w:pPr>
+              <w:spacing w:after="20"/>
+            </w:pPr>
+            <w:r>
+              <w:rPr>
+                <w:b/>
+                <w:bCs/>
+                <w:sz w:val="19"/>
+                <w:szCs w:val="19"/>
+              </w:rPr>
+              <w:t xml:space="preserve">Vercel</w:t>
+            </w:r>
+            <w:r>
+              <w:rPr>
+                <w:sz w:val="19"/>
+                <w:szCs w:val="19"/>
+              </w:rPr>
+              <w:t xml:space="preserve"> (producción) y </w:t>
+            </w:r>
+            <w:r>
+              <w:rPr>
+                <w:b/>
+                <w:bCs/>
+                <w:sz w:val="19"/>
+                <w:szCs w:val="19"/>
+              </w:rPr>
               <w:t xml:space="preserve">Vercel Blob</w:t>
             </w:r>
           </w:p>
@@ -2105,7 +2282,7 @@
               <w:bottom w:val="single" w:color="C9D3CD" w:sz="4"/>
               <w:right w:val="single" w:color="C9D3CD" w:sz="4"/>
             </w:tcBorders>
-            <w:shd w:fill="FFFFFF" w:val="clear"/>
+            <w:shd w:fill="F3F8F5" w:val="clear"/>
             <w:tcMar>
               <w:top w:type="dxa" w:w="60"/>
               <w:left w:type="dxa" w:w="90"/>
@@ -5950,6 +6127,106 @@
       </w:r>
       <w:r>
         <w:t xml:space="preserve"> (firmado con la cuenta, de un solo uso).</w:t>
+      </w:r>
+    </w:p>
+    <w:p>
+      <w:pPr>
+        <w:pStyle w:val="ListParagraph"/>
+        <w:numPr>
+          <w:ilvl w:val="0"/>
+          <w:numId w:val="2"/>
+        </w:numPr>
+        <w:spacing w:after="50"/>
+      </w:pPr>
+      <w:r>
+        <w:rPr>
+          <w:b/>
+          <w:bCs/>
+        </w:rPr>
+        <w:t xml:space="preserve">Sobre el almacenamiento:</w:t>
+      </w:r>
+      <w:r>
+        <w:t xml:space="preserve"> el estado del mercado es un documento en Vercel Blob con control de concurrencia (ETag), no una base de datos relacional. Se probó con depósitos simultáneos. Para un producto real iría a Postgres.</w:t>
+      </w:r>
+    </w:p>
+    <w:p>
+      <w:pPr>
+        <w:pStyle w:val="Heading3"/>
+      </w:pPr>
+      <w:r>
+        <w:t xml:space="preserve">Indexador de Aval (Envio) y cómo lo usa Preste</w:t>
+      </w:r>
+    </w:p>
+    <w:p>
+      <w:pPr>
+        <w:spacing w:after="100"/>
+      </w:pPr>
+      <w:r>
+        <w:t xml:space="preserve">Alan agregó un </w:t>
+      </w:r>
+      <w:r>
+        <w:rPr>
+          <w:b/>
+          <w:bCs/>
+        </w:rPr>
+        <w:t xml:space="preserve">indexador de Envio HyperIndex</w:t>
+      </w:r>
+      <w:r>
+        <w:t xml:space="preserve"> que lee los eventos de los contratos de Aval y del Reputation Registry de ERC-8004 y calcula un </w:t>
+      </w:r>
+      <w:r>
+        <w:rPr>
+          <w:b/>
+          <w:bCs/>
+        </w:rPr>
+        <w:t xml:space="preserve">puntaje verificado</w:t>
+      </w:r>
+      <w:r>
+        <w:t xml:space="preserve"> por servicio: solo cuenta a quienes pagaron, descarta autopagos y exige varias personas distintas. Preste lo consume desde Actividad: el SDK trae la misma función de cálculo (</w:t>
+      </w:r>
+      <w:r>
+        <w:rPr>
+          <w:rFonts w:ascii="Consolas" w:cs="Consolas" w:eastAsia="Consolas" w:hAnsi="Consolas"/>
+          <w:color w:val="1B4332"/>
+          <w:sz w:val="20"/>
+          <w:szCs w:val="20"/>
+        </w:rPr>
+        <w:t xml:space="preserve">computeVerifiedScore</w:t>
+      </w:r>
+      <w:r>
+        <w:t xml:space="preserve">), así que la app </w:t>
+      </w:r>
+      <w:r>
+        <w:rPr>
+          <w:b/>
+          <w:bCs/>
+        </w:rPr>
+        <w:t xml:space="preserve">recalcula el puntaje con los datos en bruto y lo compara</w:t>
+      </w:r>
+      <w:r>
+        <w:t xml:space="preserve"> con lo que dice el indexador, en vez de creerle. Se probó con un indexador de prueba: con datos honestos coincide, y con el puntaje alterado muestra "No coincide". Se activa con la variable </w:t>
+      </w:r>
+      <w:r>
+        <w:rPr>
+          <w:rFonts w:ascii="Consolas" w:cs="Consolas" w:eastAsia="Consolas" w:hAnsi="Consolas"/>
+          <w:color w:val="1B4332"/>
+          <w:sz w:val="20"/>
+          <w:szCs w:val="20"/>
+        </w:rPr>
+        <w:t xml:space="preserve">INDEXER_URL</w:t>
+      </w:r>
+      <w:r>
+        <w:t xml:space="preserve"> (la URL del GraphQL en Envio Cloud). Esto también permitiría sumar la bounty </w:t>
+      </w:r>
+      <w:r>
+        <w:rPr>
+          <w:b/>
+          <w:bCs/>
+        </w:rPr>
+        <w:t xml:space="preserve">Best Use of Envio</w:t>
+      </w:r>
+      <w:r>
+        <w:t xml:space="preserve"> ($1,000) si la URL funciona.</w:t>
       </w:r>
     </w:p>
     <w:p>

</xml_diff>